<commit_message>
Atualiza links e QR para o repositorio da Fase 6
</commit_message>
<xml_diff>
--- a/docs/Protege_Mais_Fase6_Documento.docx
+++ b/docs/Protege_Mais_Fase6_Documento.docx
@@ -336,7 +336,7 @@
           <w:color w:val="1A4DA0"/>
           <w:sz w:val="19"/>
         </w:rPr>
-        <w:t>github.com/Gabriell230G/hackgovProtegeMais</w:t>
+        <w:t>github.com/Gabriell230G/ProtegeMais-Fase-6</w:t>
       </w:r>
     </w:p>
     <w:p>
@@ -694,7 +694,7 @@
               <w:jc w:val="left"/>
             </w:pPr>
             <w:r>
-              <w:t xml:space="preserve">github.com/Gabriell230G/hackgovProtegeMais</w:t>
+              <w:t xml:space="preserve">github.com/Gabriell230G/ProtegeMais-Fase-6</w:t>
             </w:r>
           </w:p>
         </w:tc>
@@ -726,7 +726,7 @@
               <w:jc w:val="left"/>
             </w:pPr>
             <w:r>
-              <w:t xml:space="preserve">gabriell230g.github.io/hackgovProtegeMais</w:t>
+              <w:t xml:space="preserve">gabriell230g.github.io/ProtegeMais-Fase-6</w:t>
             </w:r>
           </w:p>
         </w:tc>

</xml_diff>

<commit_message>
Corrige contagem de chaves estrangeiras, atualiza diagramas e link do video
</commit_message>
<xml_diff>
--- a/docs/Protege_Mais_Fase6_Documento.docx
+++ b/docs/Protege_Mais_Fase6_Documento.docx
@@ -1798,7 +1798,7 @@
               <w:jc w:val="right"/>
             </w:pPr>
             <w:r>
-              <w:t xml:space="preserve">14</w:t>
+              <w:t xml:space="preserve">15</w:t>
             </w:r>
           </w:p>
         </w:tc>
@@ -2687,7 +2687,7 @@
               <w:jc w:val="right"/>
             </w:pPr>
             <w:r>
-              <w:t xml:space="preserve">30</w:t>
+              <w:t xml:space="preserve">31</w:t>
             </w:r>
           </w:p>
         </w:tc>
@@ -2734,7 +2734,7 @@
               <w:jc w:val="right"/>
             </w:pPr>
             <w:r>
-              <w:t xml:space="preserve">32</w:t>
+              <w:t xml:space="preserve">33</w:t>
             </w:r>
           </w:p>
         </w:tc>
@@ -2828,7 +2828,7 @@
               <w:jc w:val="right"/>
             </w:pPr>
             <w:r>
-              <w:t xml:space="preserve">35</w:t>
+              <w:t xml:space="preserve">36</w:t>
             </w:r>
           </w:p>
         </w:tc>
@@ -2922,7 +2922,7 @@
               <w:jc w:val="right"/>
             </w:pPr>
             <w:r>
-              <w:t xml:space="preserve">38</w:t>
+              <w:t xml:space="preserve">39</w:t>
             </w:r>
           </w:p>
         </w:tc>
@@ -2969,7 +2969,7 @@
               <w:jc w:val="right"/>
             </w:pPr>
             <w:r>
-              <w:t xml:space="preserve">39</w:t>
+              <w:t xml:space="preserve">40</w:t>
             </w:r>
           </w:p>
         </w:tc>
@@ -3016,7 +3016,7 @@
               <w:jc w:val="right"/>
             </w:pPr>
             <w:r>
-              <w:t xml:space="preserve">40</w:t>
+              <w:t xml:space="preserve">41</w:t>
             </w:r>
           </w:p>
         </w:tc>
@@ -3063,7 +3063,7 @@
               <w:jc w:val="right"/>
             </w:pPr>
             <w:r>
-              <w:t xml:space="preserve">42</w:t>
+              <w:t xml:space="preserve">43</w:t>
             </w:r>
           </w:p>
         </w:tc>
@@ -3110,7 +3110,7 @@
               <w:jc w:val="right"/>
             </w:pPr>
             <w:r>
-              <w:t xml:space="preserve">43</w:t>
+              <w:t xml:space="preserve">44</w:t>
             </w:r>
           </w:p>
         </w:tc>
@@ -3157,7 +3157,7 @@
               <w:jc w:val="right"/>
             </w:pPr>
             <w:r>
-              <w:t xml:space="preserve">44</w:t>
+              <w:t xml:space="preserve">45</w:t>
             </w:r>
           </w:p>
         </w:tc>
@@ -3249,7 +3249,7 @@
               <w:rPr>
                 <w:b/>
               </w:rPr>
-              <w:t xml:space="preserve">46</w:t>
+              <w:t xml:space="preserve">47</w:t>
             </w:r>
           </w:p>
         </w:tc>
@@ -3296,7 +3296,7 @@
               <w:jc w:val="right"/>
             </w:pPr>
             <w:r>
-              <w:t xml:space="preserve">46</w:t>
+              <w:t xml:space="preserve">47</w:t>
             </w:r>
           </w:p>
         </w:tc>
@@ -3343,7 +3343,7 @@
               <w:jc w:val="right"/>
             </w:pPr>
             <w:r>
-              <w:t xml:space="preserve">47</w:t>
+              <w:t xml:space="preserve">48</w:t>
             </w:r>
           </w:p>
         </w:tc>
@@ -3390,7 +3390,7 @@
               <w:jc w:val="right"/>
             </w:pPr>
             <w:r>
-              <w:t xml:space="preserve">53</w:t>
+              <w:t xml:space="preserve">54</w:t>
             </w:r>
           </w:p>
         </w:tc>
@@ -3437,7 +3437,7 @@
               <w:jc w:val="right"/>
             </w:pPr>
             <w:r>
-              <w:t xml:space="preserve">54</w:t>
+              <w:t xml:space="preserve">55</w:t>
             </w:r>
           </w:p>
         </w:tc>
@@ -3484,7 +3484,7 @@
               <w:jc w:val="right"/>
             </w:pPr>
             <w:r>
-              <w:t xml:space="preserve">55</w:t>
+              <w:t xml:space="preserve">56</w:t>
             </w:r>
           </w:p>
         </w:tc>
@@ -3531,7 +3531,7 @@
               <w:jc w:val="right"/>
             </w:pPr>
             <w:r>
-              <w:t xml:space="preserve">55</w:t>
+              <w:t xml:space="preserve">56</w:t>
             </w:r>
           </w:p>
         </w:tc>
@@ -3578,7 +3578,7 @@
               <w:jc w:val="right"/>
             </w:pPr>
             <w:r>
-              <w:t xml:space="preserve">57</w:t>
+              <w:t xml:space="preserve">58</w:t>
             </w:r>
           </w:p>
         </w:tc>
@@ -3625,7 +3625,7 @@
               <w:jc w:val="right"/>
             </w:pPr>
             <w:r>
-              <w:t xml:space="preserve">58</w:t>
+              <w:t xml:space="preserve">59</w:t>
             </w:r>
           </w:p>
         </w:tc>
@@ -3672,7 +3672,7 @@
               <w:jc w:val="right"/>
             </w:pPr>
             <w:r>
-              <w:t xml:space="preserve">59</w:t>
+              <w:t xml:space="preserve">60</w:t>
             </w:r>
           </w:p>
         </w:tc>
@@ -3719,7 +3719,7 @@
               <w:jc w:val="right"/>
             </w:pPr>
             <w:r>
-              <w:t xml:space="preserve">61</w:t>
+              <w:t xml:space="preserve">62</w:t>
             </w:r>
           </w:p>
         </w:tc>
@@ -3766,7 +3766,7 @@
               <w:jc w:val="right"/>
             </w:pPr>
             <w:r>
-              <w:t xml:space="preserve">62</w:t>
+              <w:t xml:space="preserve">63</w:t>
             </w:r>
           </w:p>
         </w:tc>
@@ -3813,7 +3813,7 @@
               <w:jc w:val="right"/>
             </w:pPr>
             <w:r>
-              <w:t xml:space="preserve">62</w:t>
+              <w:t xml:space="preserve">63</w:t>
             </w:r>
           </w:p>
         </w:tc>
@@ -3860,7 +3860,7 @@
               <w:jc w:val="right"/>
             </w:pPr>
             <w:r>
-              <w:t xml:space="preserve">63</w:t>
+              <w:t xml:space="preserve">64</w:t>
             </w:r>
           </w:p>
         </w:tc>
@@ -3905,7 +3905,7 @@
               <w:rPr>
                 <w:b/>
               </w:rPr>
-              <w:t xml:space="preserve">65</w:t>
+              <w:t xml:space="preserve">66</w:t>
             </w:r>
           </w:p>
         </w:tc>
@@ -3952,7 +3952,7 @@
               <w:jc w:val="right"/>
             </w:pPr>
             <w:r>
-              <w:t xml:space="preserve">65</w:t>
+              <w:t xml:space="preserve">66</w:t>
             </w:r>
           </w:p>
         </w:tc>
@@ -3999,7 +3999,7 @@
               <w:jc w:val="right"/>
             </w:pPr>
             <w:r>
-              <w:t xml:space="preserve">65</w:t>
+              <w:t xml:space="preserve">66</w:t>
             </w:r>
           </w:p>
         </w:tc>
@@ -4046,7 +4046,7 @@
               <w:jc w:val="right"/>
             </w:pPr>
             <w:r>
-              <w:t xml:space="preserve">66</w:t>
+              <w:t xml:space="preserve">67</w:t>
             </w:r>
           </w:p>
         </w:tc>
@@ -4093,7 +4093,7 @@
               <w:jc w:val="right"/>
             </w:pPr>
             <w:r>
-              <w:t xml:space="preserve">67</w:t>
+              <w:t xml:space="preserve">68</w:t>
             </w:r>
           </w:p>
         </w:tc>
@@ -4138,7 +4138,7 @@
               <w:rPr>
                 <w:b/>
               </w:rPr>
-              <w:t xml:space="preserve">68</w:t>
+              <w:t xml:space="preserve">69</w:t>
             </w:r>
           </w:p>
         </w:tc>
@@ -4177,7 +4177,7 @@
               <w:jc w:val="right"/>
             </w:pPr>
             <w:r>
-              <w:t xml:space="preserve">68</w:t>
+              <w:t xml:space="preserve">69</w:t>
             </w:r>
           </w:p>
         </w:tc>
@@ -4216,7 +4216,7 @@
               <w:jc w:val="right"/>
             </w:pPr>
             <w:r>
-              <w:t xml:space="preserve">68</w:t>
+              <w:t xml:space="preserve">69</w:t>
             </w:r>
           </w:p>
         </w:tc>
@@ -4255,7 +4255,7 @@
               <w:jc w:val="right"/>
             </w:pPr>
             <w:r>
-              <w:t xml:space="preserve">69</w:t>
+              <w:t xml:space="preserve">70</w:t>
             </w:r>
           </w:p>
         </w:tc>
@@ -4294,7 +4294,7 @@
               <w:jc w:val="right"/>
             </w:pPr>
             <w:r>
-              <w:t xml:space="preserve">69</w:t>
+              <w:t xml:space="preserve">70</w:t>
             </w:r>
           </w:p>
         </w:tc>
@@ -4333,7 +4333,7 @@
               <w:jc w:val="right"/>
             </w:pPr>
             <w:r>
-              <w:t xml:space="preserve">70</w:t>
+              <w:t xml:space="preserve">71</w:t>
             </w:r>
           </w:p>
         </w:tc>
@@ -4372,7 +4372,7 @@
               <w:jc w:val="right"/>
             </w:pPr>
             <w:r>
-              <w:t xml:space="preserve">70</w:t>
+              <w:t xml:space="preserve">71</w:t>
             </w:r>
           </w:p>
         </w:tc>
@@ -4417,7 +4417,7 @@
               <w:rPr>
                 <w:b/>
               </w:rPr>
-              <w:t xml:space="preserve">72</w:t>
+              <w:t xml:space="preserve">73</w:t>
             </w:r>
           </w:p>
         </w:tc>
@@ -4456,7 +4456,7 @@
               <w:jc w:val="right"/>
             </w:pPr>
             <w:r>
-              <w:t xml:space="preserve">72</w:t>
+              <w:t xml:space="preserve">73</w:t>
             </w:r>
           </w:p>
         </w:tc>
@@ -4495,7 +4495,7 @@
               <w:jc w:val="right"/>
             </w:pPr>
             <w:r>
-              <w:t xml:space="preserve">73</w:t>
+              <w:t xml:space="preserve">74</w:t>
             </w:r>
           </w:p>
         </w:tc>
@@ -4534,7 +4534,7 @@
               <w:jc w:val="right"/>
             </w:pPr>
             <w:r>
-              <w:t xml:space="preserve">74</w:t>
+              <w:t xml:space="preserve">75</w:t>
             </w:r>
           </w:p>
         </w:tc>
@@ -4573,7 +4573,7 @@
               <w:jc w:val="right"/>
             </w:pPr>
             <w:r>
-              <w:t xml:space="preserve">74</w:t>
+              <w:t xml:space="preserve">75</w:t>
             </w:r>
           </w:p>
         </w:tc>
@@ -4612,7 +4612,7 @@
               <w:jc w:val="right"/>
             </w:pPr>
             <w:r>
-              <w:t xml:space="preserve">77</w:t>
+              <w:t xml:space="preserve">78</w:t>
             </w:r>
           </w:p>
         </w:tc>
@@ -4651,7 +4651,7 @@
               <w:jc w:val="right"/>
             </w:pPr>
             <w:r>
-              <w:t xml:space="preserve">79</w:t>
+              <w:t xml:space="preserve">80</w:t>
             </w:r>
           </w:p>
         </w:tc>
@@ -4690,7 +4690,7 @@
               <w:jc w:val="right"/>
             </w:pPr>
             <w:r>
-              <w:t xml:space="preserve">80</w:t>
+              <w:t xml:space="preserve">81</w:t>
             </w:r>
           </w:p>
         </w:tc>
@@ -6704,7 +6704,7 @@
               <w:jc w:val="right"/>
             </w:pPr>
             <w:r>
-              <w:t xml:space="preserve">11</w:t>
+              <w:t xml:space="preserve">10</w:t>
             </w:r>
           </w:p>
         </w:tc>
@@ -6719,7 +6719,7 @@
               <w:jc w:val="right"/>
             </w:pPr>
             <w:r>
-              <w:t xml:space="preserve">sem alteração</w:t>
+              <w:t xml:space="preserve">recontagem</w:t>
             </w:r>
           </w:p>
         </w:tc>
@@ -7329,52 +7329,43 @@
         <w:pStyle w:val="BodyText"/>
       </w:pPr>
       <w:r>
-        <w:t xml:space="preserve">A terceira é que</w:t>
-      </w:r>
-      <w:r>
-        <w:t xml:space="preserve"> </w:t>
+        <w:t xml:space="preserve">A terceira é que </w:t>
       </w:r>
       <w:r>
         <w:rPr>
           <w:b/>
         </w:rPr>
-        <w:t xml:space="preserve">as chaves estrangeiras não mudaram, e isso é intencional</w:t>
-      </w:r>
-      <w:r>
-        <w:t xml:space="preserve">. As</w:t>
-      </w:r>
-      <w:r>
-        <w:t xml:space="preserve"> </w:t>
-      </w:r>
-      <w:r>
-        <w:t xml:space="preserve">três tabelas novas não referenciam</w:t>
-      </w:r>
-      <w:r>
-        <w:t xml:space="preserve"> </w:t>
+        <w:t xml:space="preserve">as chaves estrangeiras não mudaram no código, mas a contagem mudou</w:t>
+      </w:r>
+      <w:r>
+        <w:t xml:space="preserve">. O resumo no fim do arquivo </w:t>
       </w:r>
       <w:r>
         <w:rPr>
           <w:rStyle w:val="VerbatimChar"/>
         </w:rPr>
+        <w:t xml:space="preserve">01_ddl_oracle.sql</w:t>
+      </w:r>
+      <w:r>
+        <w:t xml:space="preserve"> declarava onze desde a Fase 5, e a apuração desta fase, contando as cláusulas </w:t>
+      </w:r>
+      <w:r>
+        <w:rPr>
+          <w:rStyle w:val="VerbatimChar"/>
+        </w:rPr>
+        <w:t xml:space="preserve">FOREIGN KEY</w:t>
+      </w:r>
+      <w:r>
+        <w:t xml:space="preserve"> efetivamente declaradas, encontrou dez. Nenhuma restrição foi removida: o número publicado é que estava um acima, e tanto a tabela acima quanto o arquivo passam a exibir o valor apurado. As três tabelas novas, por sua vez, não referenciam </w:t>
+      </w:r>
+      <w:r>
+        <w:rPr>
+          <w:rStyle w:val="VerbatimChar"/>
+        </w:rPr>
         <w:t xml:space="preserve">DENUNCIA</w:t>
       </w:r>
       <w:r>
-        <w:t xml:space="preserve"> </w:t>
-      </w:r>
-      <w:r>
-        <w:t xml:space="preserve">por chave estrangeira: elas guardam</w:t>
-      </w:r>
-      <w:r>
-        <w:t xml:space="preserve"> </w:t>
-      </w:r>
-      <w:r>
-        <w:t xml:space="preserve">o protocolo como texto. A justificativa está na seção 4.4.3, e ela é uma das</w:t>
-      </w:r>
-      <w:r>
-        <w:t xml:space="preserve"> </w:t>
-      </w:r>
-      <w:r>
-        <w:t xml:space="preserve">decisões mais discutíveis desta fase.</w:t>
+        <w:t xml:space="preserve"> por chave estrangeira: elas guardam o protocolo como texto. A justificativa está na seção 4.4.3, e ela é uma das decisões mais discutíveis desta fase.</w:t>
       </w:r>
     </w:p>
     <w:p>
@@ -16909,6 +16900,58 @@
     </w:p>
     <w:p>
       <w:pPr>
+        <w:pStyle w:val="Heading3"/>
+      </w:pPr>
+      <w:bookmarkStart w:id="900" w:name="por-que-nao-big-data"/>
+      <w:r>
+        <w:t xml:space="preserve">4.2.4 Por que não Big Data</w:t>
+      </w:r>
+      <w:bookmarkEnd w:id="900"/>
+    </w:p>
+    <w:p>
+      <w:pPr>
+        <w:pStyle w:val="FirstParagraph"/>
+      </w:pPr>
+      <w:r>
+        <w:t xml:space="preserve">O enunciado desta fase cita </w:t>
+      </w:r>
+      <w:r>
+        <w:rPr>
+          <w:b/>
+        </w:rPr>
+        <w:t xml:space="preserve">Big Data</w:t>
+      </w:r>
+      <w:r>
+        <w:t xml:space="preserve"> entre os conhecimentos a aplicar, e esta seção registra por que ele não foi empregado. Não usar uma tecnologia é uma decisão tão sujeita a justificativa quanto usá-la, e a justificativa aqui é de escala.</w:t>
+      </w:r>
+    </w:p>
+    <w:p>
+      <w:pPr>
+        <w:pStyle w:val="BodyText"/>
+      </w:pPr>
+      <w:r>
+        <w:t xml:space="preserve">A escala está medida. A base sobre a qual esta fase trabalha tem 190 denúncias e 106 eventos de dispositivos, e a janela analítica mais larga da Parte 4 recorta 160 registros. Nesses patamares, volume, variedade e velocidade são plenamente atendidos por um banco relacional com índices, e é o que a Parte 4 demonstra: as seis consultas respondem sobre a base inteira, e o agrupamento de focos custa O(k log k) sobre a janela. Introduzir armazenamento distribuído, processamento em lote ou um motor de fluxo contínuo neste ponto acrescentaria infraestrutura sem acrescentar resposta, e a seção 4.2.3 já registra o mesmo critério aplicado a outra escolha: adotar a tecnologia mais pesada antes de o problema pedir é gastar complexidade que alguém terá de manter.</w:t>
+      </w:r>
+    </w:p>
+    <w:p>
+      <w:pPr>
+        <w:pStyle w:val="BodyText"/>
+      </w:pPr>
+      <w:r>
+        <w:t xml:space="preserve">Isso não quer dizer que a questão não exista, e sim que ela não é desta entrega. O barramento armazena </w:t>
+      </w:r>
+      <w:r>
+        <w:rPr>
+          <w:b/>
+        </w:rPr>
+        <w:t xml:space="preserve">cada leitura recebida</w:t>
+      </w:r>
+      <w:r>
+        <w:t xml:space="preserve">, inclusive as que não violam o perímetro, e essa é exatamente a classe de dado que cresce com o tempo e não com a ocorrência: um parque de tornozeleiras em operação contínua produz linhas em ritmo constante, haja ou não incidente. Com os quatro totens e os aparelhos desta entrega isso é irrelevante. Com um parque real, é o primeiro lugar onde o modelo relacional pediria revisão, e aí a discussão sobre particionamento, política de retenção e armazenamento distribuído passa a ser pertinente. Registrar a fronteira é mais honesto do que atravessá-la para exibir a tecnologia.</w:t>
+      </w:r>
+    </w:p>
+    <w:p>
+      <w:pPr>
         <w:pStyle w:val="Heading2"/>
       </w:pPr>
       <w:bookmarkStart w:id="70" w:name="Xe9e0d98de61c4317f5b0b92cf92e57cb601bf8b"/>
@@ -18190,7 +18233,7 @@
         <w:t xml:space="preserve"> </w:t>
       </w:r>
       <w:r>
-        <w:t xml:space="preserve">onze chaves estrangeiras em outras relações e o projeto trate integridade</w:t>
+        <w:t xml:space="preserve">dez chaves estrangeiras em outras relações e o projeto trate integridade</w:t>
       </w:r>
       <w:r>
         <w:t xml:space="preserve"> </w:t>

</xml_diff>